<commit_message>
Update of What i did
</commit_message>
<xml_diff>
--- a/Cortes/Corte 3/Formularios LOGT 3/Emily Gongora.docx
+++ b/Cortes/Corte 3/Formularios LOGT 3/Emily Gongora.docx
@@ -322,138 +322,141 @@
               <w:bottom w:val="single" w:sz="4" w:space="0" w:color="000000"/>
               <w:right w:val="single" w:sz="4" w:space="0" w:color="000000"/>
             </w:tcBorders>
-            <w:tcMar>
-              <w:top w:w="100" w:type="dxa"/>
-              <w:left w:w="100" w:type="dxa"/>
-              <w:bottom w:w="100" w:type="dxa"/>
-              <w:right w:w="100" w:type="dxa"/>
-            </w:tcMar>
-          </w:tcPr>
-          <w:p>
-            <w:r>
-              <w:t>2/25</w:t>
-            </w:r>
-          </w:p>
-        </w:tc>
-        <w:tc>
-          <w:tcPr>
-            <w:tcW w:w="0" w:type="auto"/>
-            <w:tcBorders>
-              <w:top w:val="single" w:sz="4" w:space="0" w:color="000000"/>
-              <w:left w:val="single" w:sz="4" w:space="0" w:color="000000"/>
-              <w:bottom w:val="single" w:sz="4" w:space="0" w:color="000000"/>
-              <w:right w:val="single" w:sz="4" w:space="0" w:color="000000"/>
-            </w:tcBorders>
-            <w:tcMar>
-              <w:top w:w="100" w:type="dxa"/>
-              <w:left w:w="100" w:type="dxa"/>
-              <w:bottom w:w="100" w:type="dxa"/>
-              <w:right w:w="100" w:type="dxa"/>
-            </w:tcMar>
-          </w:tcPr>
-          <w:p>
-            <w:r>
-              <w:t>23:15</w:t>
-            </w:r>
-          </w:p>
-        </w:tc>
-        <w:tc>
-          <w:tcPr>
-            <w:tcW w:w="0" w:type="auto"/>
-            <w:tcBorders>
-              <w:top w:val="single" w:sz="4" w:space="0" w:color="000000"/>
-              <w:left w:val="single" w:sz="4" w:space="0" w:color="000000"/>
-              <w:bottom w:val="single" w:sz="4" w:space="0" w:color="000000"/>
-              <w:right w:val="single" w:sz="4" w:space="0" w:color="000000"/>
-            </w:tcBorders>
-            <w:tcMar>
-              <w:top w:w="100" w:type="dxa"/>
-              <w:left w:w="100" w:type="dxa"/>
-              <w:bottom w:w="100" w:type="dxa"/>
-              <w:right w:w="100" w:type="dxa"/>
-            </w:tcMar>
-          </w:tcPr>
-          <w:p>
-            <w:r>
-              <w:t>00:02</w:t>
-            </w:r>
-          </w:p>
-        </w:tc>
-        <w:tc>
-          <w:tcPr>
-            <w:tcW w:w="0" w:type="auto"/>
-            <w:tcBorders>
-              <w:top w:val="single" w:sz="4" w:space="0" w:color="000000"/>
-              <w:left w:val="single" w:sz="4" w:space="0" w:color="000000"/>
-              <w:bottom w:val="single" w:sz="4" w:space="0" w:color="000000"/>
-              <w:right w:val="single" w:sz="4" w:space="0" w:color="000000"/>
-            </w:tcBorders>
-            <w:tcMar>
-              <w:top w:w="100" w:type="dxa"/>
-              <w:left w:w="100" w:type="dxa"/>
-              <w:bottom w:w="100" w:type="dxa"/>
-              <w:right w:w="100" w:type="dxa"/>
-            </w:tcMar>
-          </w:tcPr>
-          <w:p>
-            <w:r>
-              <w:t>10 min</w:t>
-            </w:r>
-          </w:p>
-        </w:tc>
-        <w:tc>
-          <w:tcPr>
-            <w:tcW w:w="0" w:type="auto"/>
-            <w:tcBorders>
-              <w:top w:val="single" w:sz="4" w:space="0" w:color="000000"/>
-              <w:left w:val="single" w:sz="4" w:space="0" w:color="000000"/>
-              <w:bottom w:val="single" w:sz="4" w:space="0" w:color="000000"/>
-              <w:right w:val="single" w:sz="4" w:space="0" w:color="000000"/>
-            </w:tcBorders>
-            <w:tcMar>
-              <w:top w:w="100" w:type="dxa"/>
-              <w:left w:w="100" w:type="dxa"/>
-              <w:bottom w:w="100" w:type="dxa"/>
-              <w:right w:w="100" w:type="dxa"/>
-            </w:tcMar>
-          </w:tcPr>
-          <w:p>
-            <w:r>
-              <w:t>47 min</w:t>
-            </w:r>
-          </w:p>
-        </w:tc>
-        <w:tc>
-          <w:tcPr>
-            <w:tcW w:w="0" w:type="auto"/>
-            <w:tcBorders>
-              <w:top w:val="single" w:sz="4" w:space="0" w:color="000000"/>
-              <w:left w:val="single" w:sz="4" w:space="0" w:color="000000"/>
-              <w:bottom w:val="single" w:sz="4" w:space="0" w:color="000000"/>
-              <w:right w:val="single" w:sz="4" w:space="0" w:color="000000"/>
-            </w:tcBorders>
-            <w:tcMar>
-              <w:top w:w="100" w:type="dxa"/>
-              <w:left w:w="100" w:type="dxa"/>
-              <w:bottom w:w="100" w:type="dxa"/>
-              <w:right w:w="100" w:type="dxa"/>
-            </w:tcMar>
-          </w:tcPr>
-          <w:p>
-            <w:r>
-              <w:t>2</w:t>
-            </w:r>
-          </w:p>
-        </w:tc>
-        <w:tc>
-          <w:tcPr>
-            <w:tcW w:w="0" w:type="auto"/>
-            <w:tcBorders>
-              <w:top w:val="single" w:sz="4" w:space="0" w:color="000000"/>
-              <w:left w:val="single" w:sz="4" w:space="0" w:color="000000"/>
-              <w:bottom w:val="single" w:sz="4" w:space="0" w:color="000000"/>
-              <w:right w:val="single" w:sz="4" w:space="0" w:color="000000"/>
-            </w:tcBorders>
+            <w:shd w:val="clear" w:color="auto" w:fill="F2CEED" w:themeFill="accent5" w:themeFillTint="33"/>
+            <w:tcMar>
+              <w:top w:w="100" w:type="dxa"/>
+              <w:left w:w="100" w:type="dxa"/>
+              <w:bottom w:w="100" w:type="dxa"/>
+              <w:right w:w="100" w:type="dxa"/>
+            </w:tcMar>
+          </w:tcPr>
+          <w:p>
+            <w:r>
+              <w:t>3/18</w:t>
+            </w:r>
+          </w:p>
+        </w:tc>
+        <w:tc>
+          <w:tcPr>
+            <w:tcW w:w="0" w:type="auto"/>
+            <w:tcBorders>
+              <w:top w:val="single" w:sz="4" w:space="0" w:color="000000"/>
+              <w:left w:val="single" w:sz="4" w:space="0" w:color="000000"/>
+              <w:bottom w:val="single" w:sz="4" w:space="0" w:color="000000"/>
+              <w:right w:val="single" w:sz="4" w:space="0" w:color="000000"/>
+            </w:tcBorders>
+            <w:shd w:val="clear" w:color="auto" w:fill="F2CEED" w:themeFill="accent5" w:themeFillTint="33"/>
+            <w:tcMar>
+              <w:top w:w="100" w:type="dxa"/>
+              <w:left w:w="100" w:type="dxa"/>
+              <w:bottom w:w="100" w:type="dxa"/>
+              <w:right w:w="100" w:type="dxa"/>
+            </w:tcMar>
+          </w:tcPr>
+          <w:p>
+            <w:r>
+              <w:t>24:40</w:t>
+            </w:r>
+          </w:p>
+        </w:tc>
+        <w:tc>
+          <w:tcPr>
+            <w:tcW w:w="0" w:type="auto"/>
+            <w:tcBorders>
+              <w:top w:val="single" w:sz="4" w:space="0" w:color="000000"/>
+              <w:left w:val="single" w:sz="4" w:space="0" w:color="000000"/>
+              <w:bottom w:val="single" w:sz="4" w:space="0" w:color="000000"/>
+              <w:right w:val="single" w:sz="4" w:space="0" w:color="000000"/>
+            </w:tcBorders>
+            <w:shd w:val="clear" w:color="auto" w:fill="F2CEED" w:themeFill="accent5" w:themeFillTint="33"/>
+            <w:tcMar>
+              <w:top w:w="100" w:type="dxa"/>
+              <w:left w:w="100" w:type="dxa"/>
+              <w:bottom w:w="100" w:type="dxa"/>
+              <w:right w:w="100" w:type="dxa"/>
+            </w:tcMar>
+          </w:tcPr>
+          <w:p>
+            <w:r>
+              <w:t>1:44</w:t>
+            </w:r>
+          </w:p>
+        </w:tc>
+        <w:tc>
+          <w:tcPr>
+            <w:tcW w:w="0" w:type="auto"/>
+            <w:tcBorders>
+              <w:top w:val="single" w:sz="4" w:space="0" w:color="000000"/>
+              <w:left w:val="single" w:sz="4" w:space="0" w:color="000000"/>
+              <w:bottom w:val="single" w:sz="4" w:space="0" w:color="000000"/>
+              <w:right w:val="single" w:sz="4" w:space="0" w:color="000000"/>
+            </w:tcBorders>
+            <w:shd w:val="clear" w:color="auto" w:fill="F2CEED" w:themeFill="accent5" w:themeFillTint="33"/>
+            <w:tcMar>
+              <w:top w:w="100" w:type="dxa"/>
+              <w:left w:w="100" w:type="dxa"/>
+              <w:bottom w:w="100" w:type="dxa"/>
+              <w:right w:w="100" w:type="dxa"/>
+            </w:tcMar>
+          </w:tcPr>
+          <w:p/>
+        </w:tc>
+        <w:tc>
+          <w:tcPr>
+            <w:tcW w:w="0" w:type="auto"/>
+            <w:tcBorders>
+              <w:top w:val="single" w:sz="4" w:space="0" w:color="000000"/>
+              <w:left w:val="single" w:sz="4" w:space="0" w:color="000000"/>
+              <w:bottom w:val="single" w:sz="4" w:space="0" w:color="000000"/>
+              <w:right w:val="single" w:sz="4" w:space="0" w:color="000000"/>
+            </w:tcBorders>
+            <w:shd w:val="clear" w:color="auto" w:fill="F2CEED" w:themeFill="accent5" w:themeFillTint="33"/>
+            <w:tcMar>
+              <w:top w:w="100" w:type="dxa"/>
+              <w:left w:w="100" w:type="dxa"/>
+              <w:bottom w:w="100" w:type="dxa"/>
+              <w:right w:w="100" w:type="dxa"/>
+            </w:tcMar>
+          </w:tcPr>
+          <w:p>
+            <w:r>
+              <w:t>37 min</w:t>
+            </w:r>
+          </w:p>
+        </w:tc>
+        <w:tc>
+          <w:tcPr>
+            <w:tcW w:w="0" w:type="auto"/>
+            <w:tcBorders>
+              <w:top w:val="single" w:sz="4" w:space="0" w:color="000000"/>
+              <w:left w:val="single" w:sz="4" w:space="0" w:color="000000"/>
+              <w:bottom w:val="single" w:sz="4" w:space="0" w:color="000000"/>
+              <w:right w:val="single" w:sz="4" w:space="0" w:color="000000"/>
+            </w:tcBorders>
+            <w:shd w:val="clear" w:color="auto" w:fill="F2CEED" w:themeFill="accent5" w:themeFillTint="33"/>
+            <w:tcMar>
+              <w:top w:w="100" w:type="dxa"/>
+              <w:left w:w="100" w:type="dxa"/>
+              <w:bottom w:w="100" w:type="dxa"/>
+              <w:right w:w="100" w:type="dxa"/>
+            </w:tcMar>
+          </w:tcPr>
+          <w:p>
+            <w:r>
+              <w:t>3</w:t>
+            </w:r>
+          </w:p>
+        </w:tc>
+        <w:tc>
+          <w:tcPr>
+            <w:tcW w:w="0" w:type="auto"/>
+            <w:tcBorders>
+              <w:top w:val="single" w:sz="4" w:space="0" w:color="000000"/>
+              <w:left w:val="single" w:sz="4" w:space="0" w:color="000000"/>
+              <w:bottom w:val="single" w:sz="4" w:space="0" w:color="000000"/>
+              <w:right w:val="single" w:sz="4" w:space="0" w:color="000000"/>
+            </w:tcBorders>
+            <w:shd w:val="clear" w:color="auto" w:fill="F2CEED" w:themeFill="accent5" w:themeFillTint="33"/>
             <w:tcMar>
               <w:top w:w="100" w:type="dxa"/>
               <w:left w:w="100" w:type="dxa"/>
@@ -464,30 +467,28 @@
           <w:p>
             <w:pPr>
               <w:rPr>
-                <w:b/>
-                <w:bCs/>
                 <w:lang w:val="es-GT"/>
               </w:rPr>
             </w:pPr>
-            <w:proofErr w:type="gramStart"/>
             <w:r>
               <w:rPr>
                 <w:lang w:val="es-GT"/>
               </w:rPr>
-              <w:t>Conclusiones  y</w:t>
-            </w:r>
-            <w:proofErr w:type="gramEnd"/>
+              <w:t xml:space="preserve">Resumen, </w:t>
+            </w:r>
+            <w:proofErr w:type="spellStart"/>
             <w:r>
               <w:rPr>
                 <w:lang w:val="es-GT"/>
               </w:rPr>
-              <w:t xml:space="preserve"> O</w:t>
-            </w:r>
+              <w:t>Intro</w:t>
+            </w:r>
+            <w:proofErr w:type="spellEnd"/>
             <w:r>
               <w:rPr>
                 <w:lang w:val="es-GT"/>
               </w:rPr>
-              <w:t>bjetivos del proyecto.</w:t>
+              <w:t>, Completar la Tabla de V2 Evidencia y Cambios</w:t>
             </w:r>
           </w:p>
         </w:tc>
@@ -505,181 +506,174 @@
               <w:bottom w:val="single" w:sz="4" w:space="0" w:color="000000"/>
               <w:right w:val="single" w:sz="4" w:space="0" w:color="000000"/>
             </w:tcBorders>
-            <w:tcMar>
-              <w:top w:w="100" w:type="dxa"/>
-              <w:left w:w="100" w:type="dxa"/>
-              <w:bottom w:w="100" w:type="dxa"/>
-              <w:right w:w="100" w:type="dxa"/>
-            </w:tcMar>
-          </w:tcPr>
-          <w:p>
-            <w:r>
-              <w:t>2/16</w:t>
-            </w:r>
-          </w:p>
-        </w:tc>
-        <w:tc>
-          <w:tcPr>
-            <w:tcW w:w="0" w:type="auto"/>
-            <w:tcBorders>
-              <w:top w:val="single" w:sz="4" w:space="0" w:color="000000"/>
-              <w:left w:val="single" w:sz="4" w:space="0" w:color="000000"/>
-              <w:bottom w:val="single" w:sz="4" w:space="0" w:color="000000"/>
-              <w:right w:val="single" w:sz="4" w:space="0" w:color="000000"/>
-            </w:tcBorders>
-            <w:tcMar>
-              <w:top w:w="100" w:type="dxa"/>
-              <w:left w:w="100" w:type="dxa"/>
-              <w:bottom w:w="100" w:type="dxa"/>
-              <w:right w:w="100" w:type="dxa"/>
-            </w:tcMar>
-          </w:tcPr>
-          <w:p>
-            <w:r>
-              <w:t>7:30</w:t>
-            </w:r>
-          </w:p>
-        </w:tc>
-        <w:tc>
-          <w:tcPr>
-            <w:tcW w:w="0" w:type="auto"/>
-            <w:tcBorders>
-              <w:top w:val="single" w:sz="4" w:space="0" w:color="000000"/>
-              <w:left w:val="single" w:sz="4" w:space="0" w:color="000000"/>
-              <w:bottom w:val="single" w:sz="4" w:space="0" w:color="000000"/>
-              <w:right w:val="single" w:sz="4" w:space="0" w:color="000000"/>
-            </w:tcBorders>
-            <w:tcMar>
-              <w:top w:w="100" w:type="dxa"/>
-              <w:left w:w="100" w:type="dxa"/>
-              <w:bottom w:w="100" w:type="dxa"/>
-              <w:right w:w="100" w:type="dxa"/>
-            </w:tcMar>
-          </w:tcPr>
-          <w:p>
-            <w:r>
-              <w:t>8:00</w:t>
-            </w:r>
-          </w:p>
-        </w:tc>
-        <w:tc>
-          <w:tcPr>
-            <w:tcW w:w="0" w:type="auto"/>
-            <w:tcBorders>
-              <w:top w:val="single" w:sz="4" w:space="0" w:color="000000"/>
-              <w:left w:val="single" w:sz="4" w:space="0" w:color="000000"/>
-              <w:bottom w:val="single" w:sz="4" w:space="0" w:color="000000"/>
-              <w:right w:val="single" w:sz="4" w:space="0" w:color="000000"/>
-            </w:tcBorders>
-            <w:tcMar>
-              <w:top w:w="100" w:type="dxa"/>
-              <w:left w:w="100" w:type="dxa"/>
-              <w:bottom w:w="100" w:type="dxa"/>
-              <w:right w:w="100" w:type="dxa"/>
-            </w:tcMar>
-          </w:tcPr>
-          <w:p/>
-        </w:tc>
-        <w:tc>
-          <w:tcPr>
-            <w:tcW w:w="0" w:type="auto"/>
-            <w:tcBorders>
-              <w:top w:val="single" w:sz="4" w:space="0" w:color="000000"/>
-              <w:left w:val="single" w:sz="4" w:space="0" w:color="000000"/>
-              <w:bottom w:val="single" w:sz="4" w:space="0" w:color="000000"/>
-              <w:right w:val="single" w:sz="4" w:space="0" w:color="000000"/>
-            </w:tcBorders>
-            <w:tcMar>
-              <w:top w:w="100" w:type="dxa"/>
-              <w:left w:w="100" w:type="dxa"/>
-              <w:bottom w:w="100" w:type="dxa"/>
-              <w:right w:w="100" w:type="dxa"/>
-            </w:tcMar>
-          </w:tcPr>
-          <w:p>
-            <w:r>
-              <w:t xml:space="preserve">30 min </w:t>
-            </w:r>
-          </w:p>
-        </w:tc>
-        <w:tc>
-          <w:tcPr>
-            <w:tcW w:w="0" w:type="auto"/>
-            <w:tcBorders>
-              <w:top w:val="single" w:sz="4" w:space="0" w:color="000000"/>
-              <w:left w:val="single" w:sz="4" w:space="0" w:color="000000"/>
-              <w:bottom w:val="single" w:sz="4" w:space="0" w:color="000000"/>
-              <w:right w:val="single" w:sz="4" w:space="0" w:color="000000"/>
-            </w:tcBorders>
-            <w:tcMar>
-              <w:top w:w="100" w:type="dxa"/>
-              <w:left w:w="100" w:type="dxa"/>
-              <w:bottom w:w="100" w:type="dxa"/>
-              <w:right w:w="100" w:type="dxa"/>
-            </w:tcMar>
-          </w:tcPr>
-          <w:p>
-            <w:r>
-              <w:t>2</w:t>
-            </w:r>
-          </w:p>
-        </w:tc>
-        <w:tc>
-          <w:tcPr>
-            <w:tcW w:w="0" w:type="auto"/>
-            <w:tcBorders>
-              <w:top w:val="single" w:sz="4" w:space="0" w:color="000000"/>
-              <w:left w:val="single" w:sz="4" w:space="0" w:color="000000"/>
-              <w:bottom w:val="single" w:sz="4" w:space="0" w:color="000000"/>
-              <w:right w:val="single" w:sz="4" w:space="0" w:color="000000"/>
-            </w:tcBorders>
-            <w:tcMar>
-              <w:top w:w="100" w:type="dxa"/>
-              <w:left w:w="100" w:type="dxa"/>
-              <w:bottom w:w="100" w:type="dxa"/>
-              <w:right w:w="100" w:type="dxa"/>
-            </w:tcMar>
-          </w:tcPr>
-          <w:p>
-            <w:pPr>
-              <w:rPr>
-                <w:lang w:val="es-GT"/>
-              </w:rPr>
-            </w:pPr>
-            <w:r>
-              <w:rPr>
-                <w:lang w:val="es-GT"/>
-              </w:rPr>
-              <w:t xml:space="preserve">Parte de Resumen (pasando las cosas q hice en un </w:t>
-            </w:r>
+            <w:shd w:val="clear" w:color="auto" w:fill="F2CEED" w:themeFill="accent5" w:themeFillTint="33"/>
+            <w:tcMar>
+              <w:top w:w="100" w:type="dxa"/>
+              <w:left w:w="100" w:type="dxa"/>
+              <w:bottom w:w="100" w:type="dxa"/>
+              <w:right w:w="100" w:type="dxa"/>
+            </w:tcMar>
+          </w:tcPr>
+          <w:p>
+            <w:r>
+              <w:t>3/16</w:t>
+            </w:r>
+          </w:p>
+        </w:tc>
+        <w:tc>
+          <w:tcPr>
+            <w:tcW w:w="0" w:type="auto"/>
+            <w:tcBorders>
+              <w:top w:val="single" w:sz="4" w:space="0" w:color="000000"/>
+              <w:left w:val="single" w:sz="4" w:space="0" w:color="000000"/>
+              <w:bottom w:val="single" w:sz="4" w:space="0" w:color="000000"/>
+              <w:right w:val="single" w:sz="4" w:space="0" w:color="000000"/>
+            </w:tcBorders>
+            <w:shd w:val="clear" w:color="auto" w:fill="F2CEED" w:themeFill="accent5" w:themeFillTint="33"/>
+            <w:tcMar>
+              <w:top w:w="100" w:type="dxa"/>
+              <w:left w:w="100" w:type="dxa"/>
+              <w:bottom w:w="100" w:type="dxa"/>
+              <w:right w:w="100" w:type="dxa"/>
+            </w:tcMar>
+          </w:tcPr>
+          <w:p>
+            <w:r>
+              <w:t>17:40</w:t>
+            </w:r>
+          </w:p>
+        </w:tc>
+        <w:tc>
+          <w:tcPr>
+            <w:tcW w:w="0" w:type="auto"/>
+            <w:tcBorders>
+              <w:top w:val="single" w:sz="4" w:space="0" w:color="000000"/>
+              <w:left w:val="single" w:sz="4" w:space="0" w:color="000000"/>
+              <w:bottom w:val="single" w:sz="4" w:space="0" w:color="000000"/>
+              <w:right w:val="single" w:sz="4" w:space="0" w:color="000000"/>
+            </w:tcBorders>
+            <w:shd w:val="clear" w:color="auto" w:fill="F2CEED" w:themeFill="accent5" w:themeFillTint="33"/>
+            <w:tcMar>
+              <w:top w:w="100" w:type="dxa"/>
+              <w:left w:w="100" w:type="dxa"/>
+              <w:bottom w:w="100" w:type="dxa"/>
+              <w:right w:w="100" w:type="dxa"/>
+            </w:tcMar>
+          </w:tcPr>
+          <w:p>
+            <w:r>
+              <w:t>19:20</w:t>
+            </w:r>
+          </w:p>
+        </w:tc>
+        <w:tc>
+          <w:tcPr>
+            <w:tcW w:w="0" w:type="auto"/>
+            <w:tcBorders>
+              <w:top w:val="single" w:sz="4" w:space="0" w:color="000000"/>
+              <w:left w:val="single" w:sz="4" w:space="0" w:color="000000"/>
+              <w:bottom w:val="single" w:sz="4" w:space="0" w:color="000000"/>
+              <w:right w:val="single" w:sz="4" w:space="0" w:color="000000"/>
+            </w:tcBorders>
+            <w:shd w:val="clear" w:color="auto" w:fill="F2CEED" w:themeFill="accent5" w:themeFillTint="33"/>
+            <w:tcMar>
+              <w:top w:w="100" w:type="dxa"/>
+              <w:left w:w="100" w:type="dxa"/>
+              <w:bottom w:w="100" w:type="dxa"/>
+              <w:right w:w="100" w:type="dxa"/>
+            </w:tcMar>
+          </w:tcPr>
+          <w:p>
+            <w:r>
+              <w:t>10 min</w:t>
+            </w:r>
+          </w:p>
+        </w:tc>
+        <w:tc>
+          <w:tcPr>
+            <w:tcW w:w="0" w:type="auto"/>
+            <w:tcBorders>
+              <w:top w:val="single" w:sz="4" w:space="0" w:color="000000"/>
+              <w:left w:val="single" w:sz="4" w:space="0" w:color="000000"/>
+              <w:bottom w:val="single" w:sz="4" w:space="0" w:color="000000"/>
+              <w:right w:val="single" w:sz="4" w:space="0" w:color="000000"/>
+            </w:tcBorders>
+            <w:shd w:val="clear" w:color="auto" w:fill="F2CEED" w:themeFill="accent5" w:themeFillTint="33"/>
+            <w:tcMar>
+              <w:top w:w="100" w:type="dxa"/>
+              <w:left w:w="100" w:type="dxa"/>
+              <w:bottom w:w="100" w:type="dxa"/>
+              <w:right w:w="100" w:type="dxa"/>
+            </w:tcMar>
+          </w:tcPr>
+          <w:p>
+            <w:r>
+              <w:t>90 min</w:t>
+            </w:r>
+          </w:p>
+        </w:tc>
+        <w:tc>
+          <w:tcPr>
+            <w:tcW w:w="0" w:type="auto"/>
+            <w:tcBorders>
+              <w:top w:val="single" w:sz="4" w:space="0" w:color="000000"/>
+              <w:left w:val="single" w:sz="4" w:space="0" w:color="000000"/>
+              <w:bottom w:val="single" w:sz="4" w:space="0" w:color="000000"/>
+              <w:right w:val="single" w:sz="4" w:space="0" w:color="000000"/>
+            </w:tcBorders>
+            <w:shd w:val="clear" w:color="auto" w:fill="F2CEED" w:themeFill="accent5" w:themeFillTint="33"/>
+            <w:tcMar>
+              <w:top w:w="100" w:type="dxa"/>
+              <w:left w:w="100" w:type="dxa"/>
+              <w:bottom w:w="100" w:type="dxa"/>
+              <w:right w:w="100" w:type="dxa"/>
+            </w:tcMar>
+          </w:tcPr>
+          <w:p>
+            <w:r>
+              <w:t>3</w:t>
+            </w:r>
+          </w:p>
+        </w:tc>
+        <w:tc>
+          <w:tcPr>
+            <w:tcW w:w="0" w:type="auto"/>
+            <w:tcBorders>
+              <w:top w:val="single" w:sz="4" w:space="0" w:color="000000"/>
+              <w:left w:val="single" w:sz="4" w:space="0" w:color="000000"/>
+              <w:bottom w:val="single" w:sz="4" w:space="0" w:color="000000"/>
+              <w:right w:val="single" w:sz="4" w:space="0" w:color="000000"/>
+            </w:tcBorders>
+            <w:shd w:val="clear" w:color="auto" w:fill="F2CEED" w:themeFill="accent5" w:themeFillTint="33"/>
+            <w:tcMar>
+              <w:top w:w="100" w:type="dxa"/>
+              <w:left w:w="100" w:type="dxa"/>
+              <w:bottom w:w="100" w:type="dxa"/>
+              <w:right w:w="100" w:type="dxa"/>
+            </w:tcMar>
+          </w:tcPr>
+          <w:p>
             <w:proofErr w:type="spellStart"/>
             <w:r>
-              <w:rPr>
-                <w:lang w:val="es-GT"/>
-              </w:rPr>
-              <w:t>doc</w:t>
+              <w:t>Diagrama</w:t>
             </w:r>
             <w:proofErr w:type="spellEnd"/>
             <w:r>
-              <w:rPr>
-                <w:lang w:val="es-GT"/>
-              </w:rPr>
-              <w:t xml:space="preserve"> aparte en el </w:t>
+              <w:t xml:space="preserve"> de </w:t>
             </w:r>
             <w:proofErr w:type="spellStart"/>
             <w:r>
-              <w:rPr>
-                <w:lang w:val="es-GT"/>
-              </w:rPr>
-              <w:t>word</w:t>
+              <w:t>clases</w:t>
             </w:r>
             <w:proofErr w:type="spellEnd"/>
             <w:r>
-              <w:rPr>
-                <w:lang w:val="es-GT"/>
-              </w:rPr>
-              <w:t>)</w:t>
-            </w:r>
+              <w:t xml:space="preserve"> </w:t>
+            </w:r>
+            <w:proofErr w:type="spellStart"/>
+            <w:r>
+              <w:t>persistentes</w:t>
+            </w:r>
+            <w:proofErr w:type="spellEnd"/>
           </w:p>
         </w:tc>
       </w:tr>
@@ -696,6 +690,550 @@
               <w:bottom w:val="single" w:sz="4" w:space="0" w:color="000000"/>
               <w:right w:val="single" w:sz="4" w:space="0" w:color="000000"/>
             </w:tcBorders>
+            <w:shd w:val="clear" w:color="auto" w:fill="F2CEED" w:themeFill="accent5" w:themeFillTint="33"/>
+            <w:tcMar>
+              <w:top w:w="100" w:type="dxa"/>
+              <w:left w:w="100" w:type="dxa"/>
+              <w:bottom w:w="100" w:type="dxa"/>
+              <w:right w:w="100" w:type="dxa"/>
+            </w:tcMar>
+          </w:tcPr>
+          <w:p>
+            <w:r>
+              <w:t>3/16</w:t>
+            </w:r>
+          </w:p>
+        </w:tc>
+        <w:tc>
+          <w:tcPr>
+            <w:tcW w:w="0" w:type="auto"/>
+            <w:tcBorders>
+              <w:top w:val="single" w:sz="4" w:space="0" w:color="000000"/>
+              <w:left w:val="single" w:sz="4" w:space="0" w:color="000000"/>
+              <w:bottom w:val="single" w:sz="4" w:space="0" w:color="000000"/>
+              <w:right w:val="single" w:sz="4" w:space="0" w:color="000000"/>
+            </w:tcBorders>
+            <w:shd w:val="clear" w:color="auto" w:fill="F2CEED" w:themeFill="accent5" w:themeFillTint="33"/>
+            <w:tcMar>
+              <w:top w:w="100" w:type="dxa"/>
+              <w:left w:w="100" w:type="dxa"/>
+              <w:bottom w:w="100" w:type="dxa"/>
+              <w:right w:w="100" w:type="dxa"/>
+            </w:tcMar>
+          </w:tcPr>
+          <w:p>
+            <w:r>
+              <w:t>24:30</w:t>
+            </w:r>
+          </w:p>
+        </w:tc>
+        <w:tc>
+          <w:tcPr>
+            <w:tcW w:w="0" w:type="auto"/>
+            <w:tcBorders>
+              <w:top w:val="single" w:sz="4" w:space="0" w:color="000000"/>
+              <w:left w:val="single" w:sz="4" w:space="0" w:color="000000"/>
+              <w:bottom w:val="single" w:sz="4" w:space="0" w:color="000000"/>
+              <w:right w:val="single" w:sz="4" w:space="0" w:color="000000"/>
+            </w:tcBorders>
+            <w:shd w:val="clear" w:color="auto" w:fill="F2CEED" w:themeFill="accent5" w:themeFillTint="33"/>
+            <w:tcMar>
+              <w:top w:w="100" w:type="dxa"/>
+              <w:left w:w="100" w:type="dxa"/>
+              <w:bottom w:w="100" w:type="dxa"/>
+              <w:right w:w="100" w:type="dxa"/>
+            </w:tcMar>
+          </w:tcPr>
+          <w:p>
+            <w:r>
+              <w:t>1:10</w:t>
+            </w:r>
+          </w:p>
+        </w:tc>
+        <w:tc>
+          <w:tcPr>
+            <w:tcW w:w="0" w:type="auto"/>
+            <w:tcBorders>
+              <w:top w:val="single" w:sz="4" w:space="0" w:color="000000"/>
+              <w:left w:val="single" w:sz="4" w:space="0" w:color="000000"/>
+              <w:bottom w:val="single" w:sz="4" w:space="0" w:color="000000"/>
+              <w:right w:val="single" w:sz="4" w:space="0" w:color="000000"/>
+            </w:tcBorders>
+            <w:shd w:val="clear" w:color="auto" w:fill="F2CEED" w:themeFill="accent5" w:themeFillTint="33"/>
+            <w:tcMar>
+              <w:top w:w="100" w:type="dxa"/>
+              <w:left w:w="100" w:type="dxa"/>
+              <w:bottom w:w="100" w:type="dxa"/>
+              <w:right w:w="100" w:type="dxa"/>
+            </w:tcMar>
+          </w:tcPr>
+          <w:p/>
+        </w:tc>
+        <w:tc>
+          <w:tcPr>
+            <w:tcW w:w="0" w:type="auto"/>
+            <w:tcBorders>
+              <w:top w:val="single" w:sz="4" w:space="0" w:color="000000"/>
+              <w:left w:val="single" w:sz="4" w:space="0" w:color="000000"/>
+              <w:bottom w:val="single" w:sz="4" w:space="0" w:color="000000"/>
+              <w:right w:val="single" w:sz="4" w:space="0" w:color="000000"/>
+            </w:tcBorders>
+            <w:shd w:val="clear" w:color="auto" w:fill="F2CEED" w:themeFill="accent5" w:themeFillTint="33"/>
+            <w:tcMar>
+              <w:top w:w="100" w:type="dxa"/>
+              <w:left w:w="100" w:type="dxa"/>
+              <w:bottom w:w="100" w:type="dxa"/>
+              <w:right w:w="100" w:type="dxa"/>
+            </w:tcMar>
+          </w:tcPr>
+          <w:p>
+            <w:r>
+              <w:t>36 min</w:t>
+            </w:r>
+          </w:p>
+        </w:tc>
+        <w:tc>
+          <w:tcPr>
+            <w:tcW w:w="0" w:type="auto"/>
+            <w:tcBorders>
+              <w:top w:val="single" w:sz="4" w:space="0" w:color="000000"/>
+              <w:left w:val="single" w:sz="4" w:space="0" w:color="000000"/>
+              <w:bottom w:val="single" w:sz="4" w:space="0" w:color="000000"/>
+              <w:right w:val="single" w:sz="4" w:space="0" w:color="000000"/>
+            </w:tcBorders>
+            <w:shd w:val="clear" w:color="auto" w:fill="F2CEED" w:themeFill="accent5" w:themeFillTint="33"/>
+            <w:tcMar>
+              <w:top w:w="100" w:type="dxa"/>
+              <w:left w:w="100" w:type="dxa"/>
+              <w:bottom w:w="100" w:type="dxa"/>
+              <w:right w:w="100" w:type="dxa"/>
+            </w:tcMar>
+          </w:tcPr>
+          <w:p>
+            <w:r>
+              <w:t>3</w:t>
+            </w:r>
+          </w:p>
+        </w:tc>
+        <w:tc>
+          <w:tcPr>
+            <w:tcW w:w="0" w:type="auto"/>
+            <w:tcBorders>
+              <w:top w:val="single" w:sz="4" w:space="0" w:color="000000"/>
+              <w:left w:val="single" w:sz="4" w:space="0" w:color="000000"/>
+              <w:bottom w:val="single" w:sz="4" w:space="0" w:color="000000"/>
+              <w:right w:val="single" w:sz="4" w:space="0" w:color="000000"/>
+            </w:tcBorders>
+            <w:shd w:val="clear" w:color="auto" w:fill="F2CEED" w:themeFill="accent5" w:themeFillTint="33"/>
+            <w:tcMar>
+              <w:top w:w="100" w:type="dxa"/>
+              <w:left w:w="100" w:type="dxa"/>
+              <w:bottom w:w="100" w:type="dxa"/>
+              <w:right w:w="100" w:type="dxa"/>
+            </w:tcMar>
+          </w:tcPr>
+          <w:p>
+            <w:pPr>
+              <w:rPr>
+                <w:lang w:val="es-GT"/>
+              </w:rPr>
+            </w:pPr>
+            <w:r>
+              <w:rPr>
+                <w:lang w:val="es-GT"/>
+              </w:rPr>
+              <w:t>Avances de V2 Prototipo Evidencia Tabla y Cambios realizados</w:t>
+            </w:r>
+          </w:p>
+        </w:tc>
+      </w:tr>
+      <w:tr>
+        <w:trPr>
+          <w:trHeight w:val="500"/>
+        </w:trPr>
+        <w:tc>
+          <w:tcPr>
+            <w:tcW w:w="0" w:type="auto"/>
+            <w:tcBorders>
+              <w:top w:val="single" w:sz="4" w:space="0" w:color="000000"/>
+              <w:left w:val="single" w:sz="4" w:space="0" w:color="000000"/>
+              <w:bottom w:val="single" w:sz="4" w:space="0" w:color="000000"/>
+              <w:right w:val="single" w:sz="4" w:space="0" w:color="000000"/>
+            </w:tcBorders>
+            <w:tcMar>
+              <w:top w:w="100" w:type="dxa"/>
+              <w:left w:w="100" w:type="dxa"/>
+              <w:bottom w:w="100" w:type="dxa"/>
+              <w:right w:w="100" w:type="dxa"/>
+            </w:tcMar>
+          </w:tcPr>
+          <w:p>
+            <w:r>
+              <w:t>2/25</w:t>
+            </w:r>
+          </w:p>
+        </w:tc>
+        <w:tc>
+          <w:tcPr>
+            <w:tcW w:w="0" w:type="auto"/>
+            <w:tcBorders>
+              <w:top w:val="single" w:sz="4" w:space="0" w:color="000000"/>
+              <w:left w:val="single" w:sz="4" w:space="0" w:color="000000"/>
+              <w:bottom w:val="single" w:sz="4" w:space="0" w:color="000000"/>
+              <w:right w:val="single" w:sz="4" w:space="0" w:color="000000"/>
+            </w:tcBorders>
+            <w:tcMar>
+              <w:top w:w="100" w:type="dxa"/>
+              <w:left w:w="100" w:type="dxa"/>
+              <w:bottom w:w="100" w:type="dxa"/>
+              <w:right w:w="100" w:type="dxa"/>
+            </w:tcMar>
+          </w:tcPr>
+          <w:p>
+            <w:r>
+              <w:t>23:15</w:t>
+            </w:r>
+          </w:p>
+        </w:tc>
+        <w:tc>
+          <w:tcPr>
+            <w:tcW w:w="0" w:type="auto"/>
+            <w:tcBorders>
+              <w:top w:val="single" w:sz="4" w:space="0" w:color="000000"/>
+              <w:left w:val="single" w:sz="4" w:space="0" w:color="000000"/>
+              <w:bottom w:val="single" w:sz="4" w:space="0" w:color="000000"/>
+              <w:right w:val="single" w:sz="4" w:space="0" w:color="000000"/>
+            </w:tcBorders>
+            <w:tcMar>
+              <w:top w:w="100" w:type="dxa"/>
+              <w:left w:w="100" w:type="dxa"/>
+              <w:bottom w:w="100" w:type="dxa"/>
+              <w:right w:w="100" w:type="dxa"/>
+            </w:tcMar>
+          </w:tcPr>
+          <w:p>
+            <w:r>
+              <w:t>00:02</w:t>
+            </w:r>
+          </w:p>
+        </w:tc>
+        <w:tc>
+          <w:tcPr>
+            <w:tcW w:w="0" w:type="auto"/>
+            <w:tcBorders>
+              <w:top w:val="single" w:sz="4" w:space="0" w:color="000000"/>
+              <w:left w:val="single" w:sz="4" w:space="0" w:color="000000"/>
+              <w:bottom w:val="single" w:sz="4" w:space="0" w:color="000000"/>
+              <w:right w:val="single" w:sz="4" w:space="0" w:color="000000"/>
+            </w:tcBorders>
+            <w:tcMar>
+              <w:top w:w="100" w:type="dxa"/>
+              <w:left w:w="100" w:type="dxa"/>
+              <w:bottom w:w="100" w:type="dxa"/>
+              <w:right w:w="100" w:type="dxa"/>
+            </w:tcMar>
+          </w:tcPr>
+          <w:p>
+            <w:r>
+              <w:t>10 min</w:t>
+            </w:r>
+          </w:p>
+        </w:tc>
+        <w:tc>
+          <w:tcPr>
+            <w:tcW w:w="0" w:type="auto"/>
+            <w:tcBorders>
+              <w:top w:val="single" w:sz="4" w:space="0" w:color="000000"/>
+              <w:left w:val="single" w:sz="4" w:space="0" w:color="000000"/>
+              <w:bottom w:val="single" w:sz="4" w:space="0" w:color="000000"/>
+              <w:right w:val="single" w:sz="4" w:space="0" w:color="000000"/>
+            </w:tcBorders>
+            <w:tcMar>
+              <w:top w:w="100" w:type="dxa"/>
+              <w:left w:w="100" w:type="dxa"/>
+              <w:bottom w:w="100" w:type="dxa"/>
+              <w:right w:w="100" w:type="dxa"/>
+            </w:tcMar>
+          </w:tcPr>
+          <w:p>
+            <w:r>
+              <w:t>47 min</w:t>
+            </w:r>
+          </w:p>
+        </w:tc>
+        <w:tc>
+          <w:tcPr>
+            <w:tcW w:w="0" w:type="auto"/>
+            <w:tcBorders>
+              <w:top w:val="single" w:sz="4" w:space="0" w:color="000000"/>
+              <w:left w:val="single" w:sz="4" w:space="0" w:color="000000"/>
+              <w:bottom w:val="single" w:sz="4" w:space="0" w:color="000000"/>
+              <w:right w:val="single" w:sz="4" w:space="0" w:color="000000"/>
+            </w:tcBorders>
+            <w:tcMar>
+              <w:top w:w="100" w:type="dxa"/>
+              <w:left w:w="100" w:type="dxa"/>
+              <w:bottom w:w="100" w:type="dxa"/>
+              <w:right w:w="100" w:type="dxa"/>
+            </w:tcMar>
+          </w:tcPr>
+          <w:p>
+            <w:r>
+              <w:t>2</w:t>
+            </w:r>
+          </w:p>
+        </w:tc>
+        <w:tc>
+          <w:tcPr>
+            <w:tcW w:w="0" w:type="auto"/>
+            <w:tcBorders>
+              <w:top w:val="single" w:sz="4" w:space="0" w:color="000000"/>
+              <w:left w:val="single" w:sz="4" w:space="0" w:color="000000"/>
+              <w:bottom w:val="single" w:sz="4" w:space="0" w:color="000000"/>
+              <w:right w:val="single" w:sz="4" w:space="0" w:color="000000"/>
+            </w:tcBorders>
+            <w:tcMar>
+              <w:top w:w="100" w:type="dxa"/>
+              <w:left w:w="100" w:type="dxa"/>
+              <w:bottom w:w="100" w:type="dxa"/>
+              <w:right w:w="100" w:type="dxa"/>
+            </w:tcMar>
+          </w:tcPr>
+          <w:p>
+            <w:pPr>
+              <w:rPr>
+                <w:b/>
+                <w:bCs/>
+                <w:lang w:val="es-GT"/>
+              </w:rPr>
+            </w:pPr>
+            <w:proofErr w:type="gramStart"/>
+            <w:r>
+              <w:rPr>
+                <w:lang w:val="es-GT"/>
+              </w:rPr>
+              <w:t>Conclusiones  y</w:t>
+            </w:r>
+            <w:proofErr w:type="gramEnd"/>
+            <w:r>
+              <w:rPr>
+                <w:lang w:val="es-GT"/>
+              </w:rPr>
+              <w:t xml:space="preserve"> O</w:t>
+            </w:r>
+            <w:r>
+              <w:rPr>
+                <w:lang w:val="es-GT"/>
+              </w:rPr>
+              <w:t>bjetivos del proyecto.</w:t>
+            </w:r>
+          </w:p>
+        </w:tc>
+      </w:tr>
+      <w:tr>
+        <w:trPr>
+          <w:trHeight w:val="500"/>
+        </w:trPr>
+        <w:tc>
+          <w:tcPr>
+            <w:tcW w:w="0" w:type="auto"/>
+            <w:tcBorders>
+              <w:top w:val="single" w:sz="4" w:space="0" w:color="000000"/>
+              <w:left w:val="single" w:sz="4" w:space="0" w:color="000000"/>
+              <w:bottom w:val="single" w:sz="4" w:space="0" w:color="000000"/>
+              <w:right w:val="single" w:sz="4" w:space="0" w:color="000000"/>
+            </w:tcBorders>
+            <w:tcMar>
+              <w:top w:w="100" w:type="dxa"/>
+              <w:left w:w="100" w:type="dxa"/>
+              <w:bottom w:w="100" w:type="dxa"/>
+              <w:right w:w="100" w:type="dxa"/>
+            </w:tcMar>
+          </w:tcPr>
+          <w:p>
+            <w:r>
+              <w:t>2/16</w:t>
+            </w:r>
+          </w:p>
+        </w:tc>
+        <w:tc>
+          <w:tcPr>
+            <w:tcW w:w="0" w:type="auto"/>
+            <w:tcBorders>
+              <w:top w:val="single" w:sz="4" w:space="0" w:color="000000"/>
+              <w:left w:val="single" w:sz="4" w:space="0" w:color="000000"/>
+              <w:bottom w:val="single" w:sz="4" w:space="0" w:color="000000"/>
+              <w:right w:val="single" w:sz="4" w:space="0" w:color="000000"/>
+            </w:tcBorders>
+            <w:tcMar>
+              <w:top w:w="100" w:type="dxa"/>
+              <w:left w:w="100" w:type="dxa"/>
+              <w:bottom w:w="100" w:type="dxa"/>
+              <w:right w:w="100" w:type="dxa"/>
+            </w:tcMar>
+          </w:tcPr>
+          <w:p>
+            <w:r>
+              <w:t>7:30</w:t>
+            </w:r>
+          </w:p>
+        </w:tc>
+        <w:tc>
+          <w:tcPr>
+            <w:tcW w:w="0" w:type="auto"/>
+            <w:tcBorders>
+              <w:top w:val="single" w:sz="4" w:space="0" w:color="000000"/>
+              <w:left w:val="single" w:sz="4" w:space="0" w:color="000000"/>
+              <w:bottom w:val="single" w:sz="4" w:space="0" w:color="000000"/>
+              <w:right w:val="single" w:sz="4" w:space="0" w:color="000000"/>
+            </w:tcBorders>
+            <w:tcMar>
+              <w:top w:w="100" w:type="dxa"/>
+              <w:left w:w="100" w:type="dxa"/>
+              <w:bottom w:w="100" w:type="dxa"/>
+              <w:right w:w="100" w:type="dxa"/>
+            </w:tcMar>
+          </w:tcPr>
+          <w:p>
+            <w:r>
+              <w:t>8:00</w:t>
+            </w:r>
+          </w:p>
+        </w:tc>
+        <w:tc>
+          <w:tcPr>
+            <w:tcW w:w="0" w:type="auto"/>
+            <w:tcBorders>
+              <w:top w:val="single" w:sz="4" w:space="0" w:color="000000"/>
+              <w:left w:val="single" w:sz="4" w:space="0" w:color="000000"/>
+              <w:bottom w:val="single" w:sz="4" w:space="0" w:color="000000"/>
+              <w:right w:val="single" w:sz="4" w:space="0" w:color="000000"/>
+            </w:tcBorders>
+            <w:tcMar>
+              <w:top w:w="100" w:type="dxa"/>
+              <w:left w:w="100" w:type="dxa"/>
+              <w:bottom w:w="100" w:type="dxa"/>
+              <w:right w:w="100" w:type="dxa"/>
+            </w:tcMar>
+          </w:tcPr>
+          <w:p/>
+        </w:tc>
+        <w:tc>
+          <w:tcPr>
+            <w:tcW w:w="0" w:type="auto"/>
+            <w:tcBorders>
+              <w:top w:val="single" w:sz="4" w:space="0" w:color="000000"/>
+              <w:left w:val="single" w:sz="4" w:space="0" w:color="000000"/>
+              <w:bottom w:val="single" w:sz="4" w:space="0" w:color="000000"/>
+              <w:right w:val="single" w:sz="4" w:space="0" w:color="000000"/>
+            </w:tcBorders>
+            <w:tcMar>
+              <w:top w:w="100" w:type="dxa"/>
+              <w:left w:w="100" w:type="dxa"/>
+              <w:bottom w:w="100" w:type="dxa"/>
+              <w:right w:w="100" w:type="dxa"/>
+            </w:tcMar>
+          </w:tcPr>
+          <w:p>
+            <w:r>
+              <w:t xml:space="preserve">30 min </w:t>
+            </w:r>
+          </w:p>
+        </w:tc>
+        <w:tc>
+          <w:tcPr>
+            <w:tcW w:w="0" w:type="auto"/>
+            <w:tcBorders>
+              <w:top w:val="single" w:sz="4" w:space="0" w:color="000000"/>
+              <w:left w:val="single" w:sz="4" w:space="0" w:color="000000"/>
+              <w:bottom w:val="single" w:sz="4" w:space="0" w:color="000000"/>
+              <w:right w:val="single" w:sz="4" w:space="0" w:color="000000"/>
+            </w:tcBorders>
+            <w:tcMar>
+              <w:top w:w="100" w:type="dxa"/>
+              <w:left w:w="100" w:type="dxa"/>
+              <w:bottom w:w="100" w:type="dxa"/>
+              <w:right w:w="100" w:type="dxa"/>
+            </w:tcMar>
+          </w:tcPr>
+          <w:p>
+            <w:r>
+              <w:t>2</w:t>
+            </w:r>
+          </w:p>
+        </w:tc>
+        <w:tc>
+          <w:tcPr>
+            <w:tcW w:w="0" w:type="auto"/>
+            <w:tcBorders>
+              <w:top w:val="single" w:sz="4" w:space="0" w:color="000000"/>
+              <w:left w:val="single" w:sz="4" w:space="0" w:color="000000"/>
+              <w:bottom w:val="single" w:sz="4" w:space="0" w:color="000000"/>
+              <w:right w:val="single" w:sz="4" w:space="0" w:color="000000"/>
+            </w:tcBorders>
+            <w:tcMar>
+              <w:top w:w="100" w:type="dxa"/>
+              <w:left w:w="100" w:type="dxa"/>
+              <w:bottom w:w="100" w:type="dxa"/>
+              <w:right w:w="100" w:type="dxa"/>
+            </w:tcMar>
+          </w:tcPr>
+          <w:p>
+            <w:pPr>
+              <w:rPr>
+                <w:lang w:val="es-GT"/>
+              </w:rPr>
+            </w:pPr>
+            <w:r>
+              <w:rPr>
+                <w:lang w:val="es-GT"/>
+              </w:rPr>
+              <w:t xml:space="preserve">Parte de Resumen (pasando las cosas q hice en un </w:t>
+            </w:r>
+            <w:proofErr w:type="spellStart"/>
+            <w:r>
+              <w:rPr>
+                <w:lang w:val="es-GT"/>
+              </w:rPr>
+              <w:t>doc</w:t>
+            </w:r>
+            <w:proofErr w:type="spellEnd"/>
+            <w:r>
+              <w:rPr>
+                <w:lang w:val="es-GT"/>
+              </w:rPr>
+              <w:t xml:space="preserve"> aparte en el </w:t>
+            </w:r>
+            <w:proofErr w:type="spellStart"/>
+            <w:r>
+              <w:rPr>
+                <w:lang w:val="es-GT"/>
+              </w:rPr>
+              <w:t>word</w:t>
+            </w:r>
+            <w:proofErr w:type="spellEnd"/>
+            <w:r>
+              <w:rPr>
+                <w:lang w:val="es-GT"/>
+              </w:rPr>
+              <w:t>)</w:t>
+            </w:r>
+          </w:p>
+        </w:tc>
+      </w:tr>
+      <w:tr>
+        <w:trPr>
+          <w:trHeight w:val="500"/>
+        </w:trPr>
+        <w:tc>
+          <w:tcPr>
+            <w:tcW w:w="0" w:type="auto"/>
+            <w:tcBorders>
+              <w:top w:val="single" w:sz="4" w:space="0" w:color="000000"/>
+              <w:left w:val="single" w:sz="4" w:space="0" w:color="000000"/>
+              <w:bottom w:val="single" w:sz="4" w:space="0" w:color="000000"/>
+              <w:right w:val="single" w:sz="4" w:space="0" w:color="000000"/>
+            </w:tcBorders>
             <w:tcMar>
               <w:top w:w="100" w:type="dxa"/>
               <w:left w:w="100" w:type="dxa"/>
@@ -1075,6 +1613,7 @@
           </w:tcPr>
           <w:p>
             <w:r>
+              <w:lastRenderedPageBreak/>
               <w:t>26/01</w:t>
             </w:r>
           </w:p>
@@ -1847,7 +2386,6 @@
   <w:style w:type="character" w:default="1" w:styleId="Fuentedeprrafopredeter">
     <w:name w:val="Default Paragraph Font"/>
     <w:uiPriority w:val="1"/>
-    <w:semiHidden/>
     <w:unhideWhenUsed/>
   </w:style>
   <w:style w:type="table" w:default="1" w:styleId="Tablanormal">

</xml_diff>